<commit_message>
feat: optimize Mag7 deep research
</commit_message>
<xml_diff>
--- a/public/investor-downloads/deep-research/mag7-next-era-losers-6f2a8c9d/report_en.docx
+++ b/public/investor-downloads/deep-research/mag7-next-era-losers-6f2a8c9d/report_en.docx
@@ -20,7 +20,7 @@
           <w:sz w:val="18"/>
           <w:rFonts w:eastAsia="PingFang SC"/>
         </w:rPr>
-        <w:t>Report date: 2026-05-24. Evidence base: AI Institute local archive through 2026-05-23T14:08:31.544Z. This is a corpus synthesis, not investment advice.</w:t>
+        <w:t>Report date: 2026-05-24. Evidence base: AI Institute local archive through 2026-05-23T14:08:31.544Z, plus external market-tape and source-link checks performed on 2026-05-24. This is a corpus synthesis, not investment advice.</w:t>
       </w:r>
     </w:p>
     <w:p>
@@ -49,6 +49,11 @@
     <w:p>
       <w:r>
         <w:t>**NVIDIA** is different. It is not the base-case fundamental loser in this corpus. It is the clearest multiple-risk name if the market moves from "scarce GPU supply" to "hyperscaler bargaining power, custom silicon, power efficiency, and upstream supply-chain allocation." The company can remain a strong earnings machine while its equity stops being the purest way to own AI capex.</w:t>
+      </w:r>
+    </w:p>
+    <w:p>
+      <w:r>
+        <w:t>The weekend tape from 2026-05-16 to 2026-05-22 sharpens that distinction. It shows risk appetite cooling from extreme greed into greed, broad U.S. equity-fund outflows alongside continued technology-sector inflows, and a narrow attention funnel around AI infrastructure. NVDA printed strong Q1 FY2027 numbers but fell over the week; MU and ASTS attracted the high-beta retail imagination; RDDT showed that social attention can coexist with falling price. The tape therefore supports the report's central distinction: **AI demand is real, but the equity winner is the name that converts attention, capex, and supply-chain scarcity into durable FCF and pricing power**.</w:t>
       </w:r>
     </w:p>
     <w:p>
@@ -390,7 +395,7 @@
                 <w:b w:val="0"/>
                 <w:sz w:val="16"/>
               </w:rPr>
-              <w:t>Tesla is also outside the corpus-validated AI infrastructure and monetization chain. In a higher real-rate environment, long-duration optionality needs proof of cash conversion, not only autonomy or robotics narrative value.</w:t>
+              <w:t>Tesla is also outside the corpus-validated AI infrastructure and monetization chain. The weekend tape shows TSLA as an attention relay rather than the strongest trading narrative; ASTS, MU, and NVDA absorbed more of the viral AI-infrastructure energy. In a higher real-rate environment, long-duration optionality needs proof of cash conversion, not only autonomy or robotics narrative value.</w:t>
             </w:r>
           </w:p>
         </w:tc>
@@ -584,7 +589,7 @@
                 <w:b w:val="0"/>
                 <w:sz w:val="16"/>
               </w:rPr>
-              <w:t>Q1 FY27 data-center revenue confirms AI capex, but the corpus also points to CSP ASIC expansion, hyperscaler bargaining, power bottlenecks, and cash moving into CoWoS/HBM, networking, and ODMs.</w:t>
+              <w:t>Q1 FY27 data-center revenue confirms AI capex, but the corpus also points to CSP ASIC expansion, hyperscaler bargaining, power bottlenecks, and cash moving into CoWoS/HBM, networking, and ODMs. The 2026-05-16 to 2026-05-22 tape adds a live confirmation: strong earnings did not prevent weekly price weakness.</w:t>
             </w:r>
           </w:p>
         </w:tc>
@@ -603,7 +608,7 @@
                 <w:b w:val="0"/>
                 <w:sz w:val="16"/>
               </w:rPr>
-              <w:t>Data-center growth keeps accelerating while margins hold, CSP ASIC penetration is delayed, and hyperscaler capex remains supply constrained.</w:t>
+              <w:t>Data-center growth keeps accelerating while margins hold, CSP ASIC penetration is delayed, hyperscaler capex remains supply constrained, and post-earnings price action reclaims leadership versus MU/AMD/DELL/ASTS-style alternatives.</w:t>
             </w:r>
           </w:p>
         </w:tc>
@@ -974,7 +979,7 @@
     </w:p>
     <w:p>
       <w:r>
-        <w:t>The selected evidence set contains 14 source reports, mainly from the TMT analyst and thematic researcher channels, covering Mag7 capex, power constraints, cloud monetization, SBC, AI hardware, ASICs, efficiency, and capex-to-FCF verification.</w:t>
+        <w:t>The selected evidence set now contains 23 sources: 14 AI Institute source reports and 9 external market-tape, company-disclosure, fund-flow, and social-attention sources. The purpose of the expansion is to keep the strategic corpus thesis intact while adding a live-market validation layer for the 2026-05-16 to 2026-05-22 window.</w:t>
       </w:r>
     </w:p>
     <w:tbl>
@@ -2165,6 +2170,708 @@
           </w:p>
         </w:tc>
       </w:tr>
+      <w:tr>
+        <w:tc>
+          <w:tcPr>
+            <w:tcW w:type="dxa" w:w="1440"/>
+            <w:vAlign w:val="top"/>
+          </w:tcPr>
+          <w:p>
+            <w:pPr>
+              <w:jc w:val="center"/>
+            </w:pPr>
+            <w:r>
+              <w:rPr>
+                <w:rFonts w:ascii="Aptos" w:hAnsi="Aptos" w:eastAsia="PingFang SC"/>
+                <w:b w:val="0"/>
+                <w:sz w:val="16"/>
+              </w:rPr>
+              <w:t>15</w:t>
+            </w:r>
+          </w:p>
+        </w:tc>
+        <w:tc>
+          <w:tcPr>
+            <w:tcW w:type="dxa" w:w="2088"/>
+            <w:vAlign w:val="top"/>
+          </w:tcPr>
+          <w:p>
+            <w:pPr>
+              <w:jc w:val="left"/>
+            </w:pPr>
+            <w:r>
+              <w:rPr>
+                <w:rFonts w:ascii="Aptos" w:hAnsi="Aptos" w:eastAsia="PingFang SC"/>
+                <w:b w:val="0"/>
+                <w:sz w:val="16"/>
+              </w:rPr>
+              <w:t>Weekend viral-market note, 2026-05-16 to 2026-05-22</w:t>
+            </w:r>
+          </w:p>
+        </w:tc>
+        <w:tc>
+          <w:tcPr>
+            <w:tcW w:type="dxa" w:w="3528"/>
+            <w:vAlign w:val="top"/>
+          </w:tcPr>
+          <w:p>
+            <w:pPr>
+              <w:jc w:val="left"/>
+            </w:pPr>
+            <w:r>
+              <w:rPr>
+                <w:rFonts w:ascii="Aptos" w:hAnsi="Aptos" w:eastAsia="PingFang SC"/>
+                <w:b w:val="0"/>
+                <w:sz w:val="16"/>
+              </w:rPr>
+              <w:t>The tape is selective technology crowding, not broad retail chase. Memorial Day closes U.S. cash equities on 2026-05-25, so the tactical reaction window is 2026-05-26.</w:t>
+            </w:r>
+          </w:p>
+        </w:tc>
+        <w:tc>
+          <w:tcPr>
+            <w:tcW w:type="dxa" w:w="2448"/>
+            <w:vAlign w:val="top"/>
+          </w:tcPr>
+          <w:p>
+            <w:pPr>
+              <w:jc w:val="center"/>
+            </w:pPr>
+            <w:r>
+              <w:rPr>
+                <w:rFonts w:ascii="Aptos" w:hAnsi="Aptos" w:eastAsia="PingFang SC"/>
+                <w:b w:val="0"/>
+                <w:sz w:val="16"/>
+              </w:rPr>
+              <w:t>Treat the viral weekend as a flow and positioning overlay, not as a replacement for the strategic Mag7 ranking.</w:t>
+            </w:r>
+          </w:p>
+        </w:tc>
+      </w:tr>
+      <w:tr>
+        <w:tc>
+          <w:tcPr>
+            <w:tcW w:type="dxa" w:w="1440"/>
+            <w:vAlign w:val="top"/>
+          </w:tcPr>
+          <w:p>
+            <w:pPr>
+              <w:jc w:val="center"/>
+            </w:pPr>
+            <w:r>
+              <w:rPr>
+                <w:rFonts w:ascii="Aptos" w:hAnsi="Aptos" w:eastAsia="PingFang SC"/>
+                <w:b w:val="0"/>
+                <w:sz w:val="16"/>
+              </w:rPr>
+              <w:t>16</w:t>
+            </w:r>
+          </w:p>
+        </w:tc>
+        <w:tc>
+          <w:tcPr>
+            <w:tcW w:type="dxa" w:w="2088"/>
+            <w:vAlign w:val="top"/>
+          </w:tcPr>
+          <w:p>
+            <w:pPr>
+              <w:jc w:val="left"/>
+            </w:pPr>
+            <w:r>
+              <w:rPr>
+                <w:rFonts w:ascii="Aptos" w:hAnsi="Aptos" w:eastAsia="PingFang SC"/>
+                <w:b w:val="0"/>
+                <w:sz w:val="16"/>
+              </w:rPr>
+              <w:t>Amsflow U.S. Fear &amp; Greed</w:t>
+            </w:r>
+          </w:p>
+        </w:tc>
+        <w:tc>
+          <w:tcPr>
+            <w:tcW w:type="dxa" w:w="3528"/>
+            <w:vAlign w:val="top"/>
+          </w:tcPr>
+          <w:p>
+            <w:pPr>
+              <w:jc w:val="left"/>
+            </w:pPr>
+            <w:r>
+              <w:rPr>
+                <w:rFonts w:ascii="Aptos" w:hAnsi="Aptos" w:eastAsia="PingFang SC"/>
+                <w:b w:val="0"/>
+                <w:sz w:val="16"/>
+              </w:rPr>
+              <w:t>Sentiment moved down from extreme greed into greed during the window.</w:t>
+            </w:r>
+          </w:p>
+        </w:tc>
+        <w:tc>
+          <w:tcPr>
+            <w:tcW w:type="dxa" w:w="2448"/>
+            <w:vAlign w:val="top"/>
+          </w:tcPr>
+          <w:p>
+            <w:pPr>
+              <w:jc w:val="center"/>
+            </w:pPr>
+            <w:r>
+              <w:rPr>
+                <w:rFonts w:ascii="Aptos" w:hAnsi="Aptos" w:eastAsia="PingFang SC"/>
+                <w:b w:val="0"/>
+                <w:sz w:val="16"/>
+              </w:rPr>
+              <w:t>Supports a selective-risk-taking frame: investors are still willing to buy AI, but they are no longer paying for every duration story.</w:t>
+            </w:r>
+          </w:p>
+        </w:tc>
+      </w:tr>
+      <w:tr>
+        <w:tc>
+          <w:tcPr>
+            <w:tcW w:type="dxa" w:w="1440"/>
+            <w:vAlign w:val="top"/>
+          </w:tcPr>
+          <w:p>
+            <w:pPr>
+              <w:jc w:val="center"/>
+            </w:pPr>
+            <w:r>
+              <w:rPr>
+                <w:rFonts w:ascii="Aptos" w:hAnsi="Aptos" w:eastAsia="PingFang SC"/>
+                <w:b w:val="0"/>
+                <w:sz w:val="16"/>
+              </w:rPr>
+              <w:t>17</w:t>
+            </w:r>
+          </w:p>
+        </w:tc>
+        <w:tc>
+          <w:tcPr>
+            <w:tcW w:type="dxa" w:w="2088"/>
+            <w:vAlign w:val="top"/>
+          </w:tcPr>
+          <w:p>
+            <w:pPr>
+              <w:jc w:val="left"/>
+            </w:pPr>
+            <w:r>
+              <w:rPr>
+                <w:rFonts w:ascii="Aptos" w:hAnsi="Aptos" w:eastAsia="PingFang SC"/>
+                <w:b w:val="0"/>
+                <w:sz w:val="16"/>
+              </w:rPr>
+              <w:t>Reuters/LSEG Lipper fund flows</w:t>
+            </w:r>
+          </w:p>
+        </w:tc>
+        <w:tc>
+          <w:tcPr>
+            <w:tcW w:type="dxa" w:w="3528"/>
+            <w:vAlign w:val="top"/>
+          </w:tcPr>
+          <w:p>
+            <w:pPr>
+              <w:jc w:val="left"/>
+            </w:pPr>
+            <w:r>
+              <w:rPr>
+                <w:rFonts w:ascii="Aptos" w:hAnsi="Aptos" w:eastAsia="PingFang SC"/>
+                <w:b w:val="0"/>
+                <w:sz w:val="16"/>
+              </w:rPr>
+              <w:t>U.S. equity funds saw outflows while technology funds and money-market funds saw inflows.</w:t>
+            </w:r>
+          </w:p>
+        </w:tc>
+        <w:tc>
+          <w:tcPr>
+            <w:tcW w:type="dxa" w:w="2448"/>
+            <w:vAlign w:val="top"/>
+          </w:tcPr>
+          <w:p>
+            <w:pPr>
+              <w:jc w:val="center"/>
+            </w:pPr>
+            <w:r>
+              <w:rPr>
+                <w:rFonts w:ascii="Aptos" w:hAnsi="Aptos" w:eastAsia="PingFang SC"/>
+                <w:b w:val="0"/>
+                <w:sz w:val="16"/>
+              </w:rPr>
+              <w:t>Confirms the contradiction: cash is defensive at the aggregate level, but AI/technology remains a crowded single-point bid.</w:t>
+            </w:r>
+          </w:p>
+        </w:tc>
+      </w:tr>
+      <w:tr>
+        <w:tc>
+          <w:tcPr>
+            <w:tcW w:type="dxa" w:w="1440"/>
+            <w:vAlign w:val="top"/>
+          </w:tcPr>
+          <w:p>
+            <w:pPr>
+              <w:jc w:val="center"/>
+            </w:pPr>
+            <w:r>
+              <w:rPr>
+                <w:rFonts w:ascii="Aptos" w:hAnsi="Aptos" w:eastAsia="PingFang SC"/>
+                <w:b w:val="0"/>
+                <w:sz w:val="16"/>
+              </w:rPr>
+              <w:t>18</w:t>
+            </w:r>
+          </w:p>
+        </w:tc>
+        <w:tc>
+          <w:tcPr>
+            <w:tcW w:type="dxa" w:w="2088"/>
+            <w:vAlign w:val="top"/>
+          </w:tcPr>
+          <w:p>
+            <w:pPr>
+              <w:jc w:val="left"/>
+            </w:pPr>
+            <w:r>
+              <w:rPr>
+                <w:rFonts w:ascii="Aptos" w:hAnsi="Aptos" w:eastAsia="PingFang SC"/>
+                <w:b w:val="0"/>
+                <w:sz w:val="16"/>
+              </w:rPr>
+              <w:t>NVDA price history and Q1 FY2027 release</w:t>
+            </w:r>
+          </w:p>
+        </w:tc>
+        <w:tc>
+          <w:tcPr>
+            <w:tcW w:type="dxa" w:w="3528"/>
+            <w:vAlign w:val="top"/>
+          </w:tcPr>
+          <w:p>
+            <w:pPr>
+              <w:jc w:val="left"/>
+            </w:pPr>
+            <w:r>
+              <w:rPr>
+                <w:rFonts w:ascii="Aptos" w:hAnsi="Aptos" w:eastAsia="PingFang SC"/>
+                <w:b w:val="0"/>
+                <w:sz w:val="16"/>
+              </w:rPr>
+              <w:t>Record revenue and data-center revenue did not stop NVDA from falling over the week.</w:t>
+            </w:r>
+          </w:p>
+        </w:tc>
+        <w:tc>
+          <w:tcPr>
+            <w:tcW w:type="dxa" w:w="2448"/>
+            <w:vAlign w:val="top"/>
+          </w:tcPr>
+          <w:p>
+            <w:pPr>
+              <w:jc w:val="center"/>
+            </w:pPr>
+            <w:r>
+              <w:rPr>
+                <w:rFonts w:ascii="Aptos" w:hAnsi="Aptos" w:eastAsia="PingFang SC"/>
+                <w:b w:val="0"/>
+                <w:sz w:val="16"/>
+              </w:rPr>
+              <w:t>Strengthens the "multiple loser, not fundamental loser" classification.</w:t>
+            </w:r>
+          </w:p>
+        </w:tc>
+      </w:tr>
+      <w:tr>
+        <w:tc>
+          <w:tcPr>
+            <w:tcW w:type="dxa" w:w="1440"/>
+            <w:vAlign w:val="top"/>
+          </w:tcPr>
+          <w:p>
+            <w:pPr>
+              <w:jc w:val="center"/>
+            </w:pPr>
+            <w:r>
+              <w:rPr>
+                <w:rFonts w:ascii="Aptos" w:hAnsi="Aptos" w:eastAsia="PingFang SC"/>
+                <w:b w:val="0"/>
+                <w:sz w:val="16"/>
+              </w:rPr>
+              <w:t>19</w:t>
+            </w:r>
+          </w:p>
+        </w:tc>
+        <w:tc>
+          <w:tcPr>
+            <w:tcW w:type="dxa" w:w="2088"/>
+            <w:vAlign w:val="top"/>
+          </w:tcPr>
+          <w:p>
+            <w:pPr>
+              <w:jc w:val="left"/>
+            </w:pPr>
+            <w:r>
+              <w:rPr>
+                <w:rFonts w:ascii="Aptos" w:hAnsi="Aptos" w:eastAsia="PingFang SC"/>
+                <w:b w:val="0"/>
+                <w:sz w:val="16"/>
+              </w:rPr>
+              <w:t>NVIDIA guidance and China compute caveat</w:t>
+            </w:r>
+          </w:p>
+        </w:tc>
+        <w:tc>
+          <w:tcPr>
+            <w:tcW w:type="dxa" w:w="3528"/>
+            <w:vAlign w:val="top"/>
+          </w:tcPr>
+          <w:p>
+            <w:pPr>
+              <w:jc w:val="left"/>
+            </w:pPr>
+            <w:r>
+              <w:rPr>
+                <w:rFonts w:ascii="Aptos" w:hAnsi="Aptos" w:eastAsia="PingFang SC"/>
+                <w:b w:val="0"/>
+                <w:sz w:val="16"/>
+              </w:rPr>
+              <w:t>Q2 revenue guide is very high, but the guide excludes China data-center compute revenue.</w:t>
+            </w:r>
+          </w:p>
+        </w:tc>
+        <w:tc>
+          <w:tcPr>
+            <w:tcW w:type="dxa" w:w="2448"/>
+            <w:vAlign w:val="top"/>
+          </w:tcPr>
+          <w:p>
+            <w:pPr>
+              <w:jc w:val="center"/>
+            </w:pPr>
+            <w:r>
+              <w:rPr>
+                <w:rFonts w:ascii="Aptos" w:hAnsi="Aptos" w:eastAsia="PingFang SC"/>
+                <w:b w:val="0"/>
+                <w:sz w:val="16"/>
+              </w:rPr>
+              <w:t>Explains why strong earnings can coexist with lower multiple: investors must price geopolitics and concentration risk.</w:t>
+            </w:r>
+          </w:p>
+        </w:tc>
+      </w:tr>
+      <w:tr>
+        <w:tc>
+          <w:tcPr>
+            <w:tcW w:type="dxa" w:w="1440"/>
+            <w:vAlign w:val="top"/>
+          </w:tcPr>
+          <w:p>
+            <w:pPr>
+              <w:jc w:val="center"/>
+            </w:pPr>
+            <w:r>
+              <w:rPr>
+                <w:rFonts w:ascii="Aptos" w:hAnsi="Aptos" w:eastAsia="PingFang SC"/>
+                <w:b w:val="0"/>
+                <w:sz w:val="16"/>
+              </w:rPr>
+              <w:t>20</w:t>
+            </w:r>
+          </w:p>
+        </w:tc>
+        <w:tc>
+          <w:tcPr>
+            <w:tcW w:type="dxa" w:w="2088"/>
+            <w:vAlign w:val="top"/>
+          </w:tcPr>
+          <w:p>
+            <w:pPr>
+              <w:jc w:val="left"/>
+            </w:pPr>
+            <w:r>
+              <w:rPr>
+                <w:rFonts w:ascii="Aptos" w:hAnsi="Aptos" w:eastAsia="PingFang SC"/>
+                <w:b w:val="0"/>
+                <w:sz w:val="16"/>
+              </w:rPr>
+              <w:t>MU/HBM tape and Micron investor materials</w:t>
+            </w:r>
+          </w:p>
+        </w:tc>
+        <w:tc>
+          <w:tcPr>
+            <w:tcW w:type="dxa" w:w="3528"/>
+            <w:vAlign w:val="top"/>
+          </w:tcPr>
+          <w:p>
+            <w:pPr>
+              <w:jc w:val="left"/>
+            </w:pPr>
+            <w:r>
+              <w:rPr>
+                <w:rFonts w:ascii="Aptos" w:hAnsi="Aptos" w:eastAsia="PingFang SC"/>
+                <w:b w:val="0"/>
+                <w:sz w:val="16"/>
+              </w:rPr>
+              <w:t>Memory became the easiest retail simplification of AI infrastructure: "AI needs memory."</w:t>
+            </w:r>
+          </w:p>
+        </w:tc>
+        <w:tc>
+          <w:tcPr>
+            <w:tcW w:type="dxa" w:w="2448"/>
+            <w:vAlign w:val="top"/>
+          </w:tcPr>
+          <w:p>
+            <w:pPr>
+              <w:jc w:val="center"/>
+            </w:pPr>
+            <w:r>
+              <w:rPr>
+                <w:rFonts w:ascii="Aptos" w:hAnsi="Aptos" w:eastAsia="PingFang SC"/>
+                <w:b w:val="0"/>
+                <w:sz w:val="16"/>
+              </w:rPr>
+              <w:t>Reinforces the profit-pool rotation from GPU scarcity to HBM/DRAM, packaging, networking, and power.</w:t>
+            </w:r>
+          </w:p>
+        </w:tc>
+      </w:tr>
+      <w:tr>
+        <w:tc>
+          <w:tcPr>
+            <w:tcW w:type="dxa" w:w="1440"/>
+            <w:vAlign w:val="top"/>
+          </w:tcPr>
+          <w:p>
+            <w:pPr>
+              <w:jc w:val="center"/>
+            </w:pPr>
+            <w:r>
+              <w:rPr>
+                <w:rFonts w:ascii="Aptos" w:hAnsi="Aptos" w:eastAsia="PingFang SC"/>
+                <w:b w:val="0"/>
+                <w:sz w:val="16"/>
+              </w:rPr>
+              <w:t>21</w:t>
+            </w:r>
+          </w:p>
+        </w:tc>
+        <w:tc>
+          <w:tcPr>
+            <w:tcW w:type="dxa" w:w="2088"/>
+            <w:vAlign w:val="top"/>
+          </w:tcPr>
+          <w:p>
+            <w:pPr>
+              <w:jc w:val="left"/>
+            </w:pPr>
+            <w:r>
+              <w:rPr>
+                <w:rFonts w:ascii="Aptos" w:hAnsi="Aptos" w:eastAsia="PingFang SC"/>
+                <w:b w:val="0"/>
+                <w:sz w:val="16"/>
+              </w:rPr>
+              <w:t>ASTS price history and FCC authorization reporting</w:t>
+            </w:r>
+          </w:p>
+        </w:tc>
+        <w:tc>
+          <w:tcPr>
+            <w:tcW w:type="dxa" w:w="3528"/>
+            <w:vAlign w:val="top"/>
+          </w:tcPr>
+          <w:p>
+            <w:pPr>
+              <w:jc w:val="left"/>
+            </w:pPr>
+            <w:r>
+              <w:rPr>
+                <w:rFonts w:ascii="Aptos" w:hAnsi="Aptos" w:eastAsia="PingFang SC"/>
+                <w:b w:val="0"/>
+                <w:sz w:val="16"/>
+              </w:rPr>
+              <w:t>Satellite direct-to-device became a high-beta weekend liquidity event, but authorization is not yet revenue.</w:t>
+            </w:r>
+          </w:p>
+        </w:tc>
+        <w:tc>
+          <w:tcPr>
+            <w:tcW w:type="dxa" w:w="2448"/>
+            <w:vAlign w:val="top"/>
+          </w:tcPr>
+          <w:p>
+            <w:pPr>
+              <w:jc w:val="center"/>
+            </w:pPr>
+            <w:r>
+              <w:rPr>
+                <w:rFonts w:ascii="Aptos" w:hAnsi="Aptos" w:eastAsia="PingFang SC"/>
+                <w:b w:val="0"/>
+                <w:sz w:val="16"/>
+              </w:rPr>
+              <w:t>Shows that attention can migrate away from Mag7 into option-like infrastructure stories.</w:t>
+            </w:r>
+          </w:p>
+        </w:tc>
+      </w:tr>
+      <w:tr>
+        <w:tc>
+          <w:tcPr>
+            <w:tcW w:type="dxa" w:w="1440"/>
+            <w:vAlign w:val="top"/>
+          </w:tcPr>
+          <w:p>
+            <w:pPr>
+              <w:jc w:val="center"/>
+            </w:pPr>
+            <w:r>
+              <w:rPr>
+                <w:rFonts w:ascii="Aptos" w:hAnsi="Aptos" w:eastAsia="PingFang SC"/>
+                <w:b w:val="0"/>
+                <w:sz w:val="16"/>
+              </w:rPr>
+              <w:t>22</w:t>
+            </w:r>
+          </w:p>
+        </w:tc>
+        <w:tc>
+          <w:tcPr>
+            <w:tcW w:type="dxa" w:w="2088"/>
+            <w:vAlign w:val="top"/>
+          </w:tcPr>
+          <w:p>
+            <w:pPr>
+              <w:jc w:val="left"/>
+            </w:pPr>
+            <w:r>
+              <w:rPr>
+                <w:rFonts w:ascii="Aptos" w:hAnsi="Aptos" w:eastAsia="PingFang SC"/>
+                <w:b w:val="0"/>
+                <w:sz w:val="16"/>
+              </w:rPr>
+              <w:t>RDDT price history</w:t>
+            </w:r>
+          </w:p>
+        </w:tc>
+        <w:tc>
+          <w:tcPr>
+            <w:tcW w:type="dxa" w:w="3528"/>
+            <w:vAlign w:val="top"/>
+          </w:tcPr>
+          <w:p>
+            <w:pPr>
+              <w:jc w:val="left"/>
+            </w:pPr>
+            <w:r>
+              <w:rPr>
+                <w:rFonts w:ascii="Aptos" w:hAnsi="Aptos" w:eastAsia="PingFang SC"/>
+                <w:b w:val="0"/>
+                <w:sz w:val="16"/>
+              </w:rPr>
+              <w:t>RDDT sold off despite platform attention and meme-stock visibility.</w:t>
+            </w:r>
+          </w:p>
+        </w:tc>
+        <w:tc>
+          <w:tcPr>
+            <w:tcW w:type="dxa" w:w="2448"/>
+            <w:vAlign w:val="top"/>
+          </w:tcPr>
+          <w:p>
+            <w:pPr>
+              <w:jc w:val="center"/>
+            </w:pPr>
+            <w:r>
+              <w:rPr>
+                <w:rFonts w:ascii="Aptos" w:hAnsi="Aptos" w:eastAsia="PingFang SC"/>
+                <w:b w:val="0"/>
+                <w:sz w:val="16"/>
+              </w:rPr>
+              <w:t>Prevents a mechanical interpretation of social mentions as buy pressure; useful when reading TSLA, NVDA, and Meta attention.</w:t>
+            </w:r>
+          </w:p>
+        </w:tc>
+      </w:tr>
+      <w:tr>
+        <w:tc>
+          <w:tcPr>
+            <w:tcW w:type="dxa" w:w="1440"/>
+            <w:vAlign w:val="top"/>
+          </w:tcPr>
+          <w:p>
+            <w:pPr>
+              <w:jc w:val="center"/>
+            </w:pPr>
+            <w:r>
+              <w:rPr>
+                <w:rFonts w:ascii="Aptos" w:hAnsi="Aptos" w:eastAsia="PingFang SC"/>
+                <w:b w:val="0"/>
+                <w:sz w:val="16"/>
+              </w:rPr>
+              <w:t>23</w:t>
+            </w:r>
+          </w:p>
+        </w:tc>
+        <w:tc>
+          <w:tcPr>
+            <w:tcW w:type="dxa" w:w="2088"/>
+            <w:vAlign w:val="top"/>
+          </w:tcPr>
+          <w:p>
+            <w:pPr>
+              <w:jc w:val="left"/>
+            </w:pPr>
+            <w:r>
+              <w:rPr>
+                <w:rFonts w:ascii="Aptos" w:hAnsi="Aptos" w:eastAsia="PingFang SC"/>
+                <w:b w:val="0"/>
+                <w:sz w:val="16"/>
+              </w:rPr>
+              <w:t>AltIndex and FearGreedMeter dynamic WSB/meme-stock lists</w:t>
+            </w:r>
+          </w:p>
+        </w:tc>
+        <w:tc>
+          <w:tcPr>
+            <w:tcW w:type="dxa" w:w="3528"/>
+            <w:vAlign w:val="top"/>
+          </w:tcPr>
+          <w:p>
+            <w:pPr>
+              <w:jc w:val="left"/>
+            </w:pPr>
+            <w:r>
+              <w:rPr>
+                <w:rFonts w:ascii="Aptos" w:hAnsi="Aptos" w:eastAsia="PingFang SC"/>
+                <w:b w:val="0"/>
+                <w:sz w:val="16"/>
+              </w:rPr>
+              <w:t>NVDA, ASTS, MU, MSFT, META and other AI-linked names stay high in social-attention screens, but the lists roll quickly.</w:t>
+            </w:r>
+          </w:p>
+        </w:tc>
+        <w:tc>
+          <w:tcPr>
+            <w:tcW w:type="dxa" w:w="2448"/>
+            <w:vAlign w:val="top"/>
+          </w:tcPr>
+          <w:p>
+            <w:pPr>
+              <w:jc w:val="center"/>
+            </w:pPr>
+            <w:r>
+              <w:rPr>
+                <w:rFonts w:ascii="Aptos" w:hAnsi="Aptos" w:eastAsia="PingFang SC"/>
+                <w:b w:val="0"/>
+                <w:sz w:val="16"/>
+              </w:rPr>
+              <w:t>Use social screens as crowding and gamma-risk signals, not as durable fundamental evidence.</w:t>
+            </w:r>
+          </w:p>
+        </w:tc>
+      </w:tr>
     </w:tbl>
     <w:p/>
     <w:p>
@@ -2172,7 +2879,596 @@
         <w:pStyle w:val="Heading2"/>
       </w:pPr>
       <w:r>
-        <w:t>5. Name-by-Name Assessment</w:t>
+        <w:t>5. External Tape Overlay: What the Viral Weekend Adds</w:t>
+      </w:r>
+    </w:p>
+    <w:p>
+      <w:r>
+        <w:t>The weekend note does not overturn the strategic ranking. It improves the timing layer and clarifies the type of loss. Apple remains the clearest strategic relative loser because the new materials still do not provide direct Apple evidence in cloud AI infrastructure, power access, inference monetization, or capex-to-FCF conversion. Tesla remains a narrative-duration risk because the attention complex shifted toward ASTS and memory/GPU supply-chain trades rather than toward Tesla as the strongest AI infrastructure expression.</w:t>
+      </w:r>
+    </w:p>
+    <w:p>
+      <w:r>
+        <w:t>The most important change is NVIDIA. The external tape makes it harder to call NVIDIA a fundamental loser and easier to call it a **multiple-risk and profit-pool-rotation loser**. Q1 FY2027 revenue of $81.6 billion and data-center revenue of $75.2 billion are too strong for a demand-collapse thesis, especially with a $91.0 billion Q2 revenue guide. But the stock's inability to expand on those numbers, combined with MU/HBM strength and ASTS-style high-beta attention, says the market is separating "AI demand exists" from "NVDA equity gets all the upside."</w:t>
+      </w:r>
+    </w:p>
+    <w:tbl>
+      <w:tblPr>
+        <w:tblStyle w:val="TableGrid"/>
+        <w:tblW w:type="auto" w:w="0"/>
+        <w:jc w:val="center"/>
+        <w:tblLayout w:type="fixed"/>
+        <w:tblLook w:firstColumn="1" w:firstRow="1" w:lastColumn="0" w:lastRow="0" w:noHBand="0" w:noVBand="1" w:val="04A0"/>
+      </w:tblPr>
+      <w:tblGrid>
+        <w:gridCol w:w="2520"/>
+        <w:gridCol w:w="2520"/>
+        <w:gridCol w:w="2520"/>
+        <w:gridCol w:w="2520"/>
+      </w:tblGrid>
+      <w:tr>
+        <w:tc>
+          <w:tcPr>
+            <w:tcW w:type="dxa" w:w="1440"/>
+            <w:vAlign w:val="top"/>
+            <w:shd w:fill="E9EEF6"/>
+          </w:tcPr>
+          <w:p>
+            <w:pPr>
+              <w:jc w:val="center"/>
+            </w:pPr>
+            <w:r>
+              <w:rPr>
+                <w:rFonts w:ascii="Aptos" w:hAnsi="Aptos" w:eastAsia="PingFang SC"/>
+                <w:b/>
+                <w:sz w:val="17"/>
+              </w:rPr>
+              <w:t>Tape signal</w:t>
+            </w:r>
+          </w:p>
+        </w:tc>
+        <w:tc>
+          <w:tcPr>
+            <w:tcW w:type="dxa" w:w="2088"/>
+            <w:vAlign w:val="top"/>
+            <w:shd w:fill="E9EEF6"/>
+          </w:tcPr>
+          <w:p>
+            <w:pPr>
+              <w:jc w:val="left"/>
+            </w:pPr>
+            <w:r>
+              <w:rPr>
+                <w:rFonts w:ascii="Aptos" w:hAnsi="Aptos" w:eastAsia="PingFang SC"/>
+                <w:b/>
+                <w:sz w:val="17"/>
+              </w:rPr>
+              <w:t>What happened</w:t>
+            </w:r>
+          </w:p>
+        </w:tc>
+        <w:tc>
+          <w:tcPr>
+            <w:tcW w:type="dxa" w:w="3528"/>
+            <w:vAlign w:val="top"/>
+            <w:shd w:fill="E9EEF6"/>
+          </w:tcPr>
+          <w:p>
+            <w:pPr>
+              <w:jc w:val="left"/>
+            </w:pPr>
+            <w:r>
+              <w:rPr>
+                <w:rFonts w:ascii="Aptos" w:hAnsi="Aptos" w:eastAsia="PingFang SC"/>
+                <w:b/>
+                <w:sz w:val="17"/>
+              </w:rPr>
+              <w:t>Mag7 interpretation</w:t>
+            </w:r>
+          </w:p>
+        </w:tc>
+        <w:tc>
+          <w:tcPr>
+            <w:tcW w:type="dxa" w:w="2448"/>
+            <w:vAlign w:val="top"/>
+            <w:shd w:fill="E9EEF6"/>
+          </w:tcPr>
+          <w:p>
+            <w:pPr>
+              <w:jc w:val="center"/>
+            </w:pPr>
+            <w:r>
+              <w:rPr>
+                <w:rFonts w:ascii="Aptos" w:hAnsi="Aptos" w:eastAsia="PingFang SC"/>
+                <w:b/>
+                <w:sz w:val="17"/>
+              </w:rPr>
+              <w:t>Actionable read-through</w:t>
+            </w:r>
+          </w:p>
+        </w:tc>
+      </w:tr>
+      <w:tr>
+        <w:tc>
+          <w:tcPr>
+            <w:tcW w:type="dxa" w:w="1440"/>
+            <w:vAlign w:val="top"/>
+          </w:tcPr>
+          <w:p>
+            <w:pPr>
+              <w:jc w:val="center"/>
+            </w:pPr>
+            <w:r>
+              <w:rPr>
+                <w:rFonts w:ascii="Aptos" w:hAnsi="Aptos" w:eastAsia="PingFang SC"/>
+                <w:b w:val="0"/>
+                <w:sz w:val="16"/>
+              </w:rPr>
+              <w:t>Sentiment and flows</w:t>
+            </w:r>
+          </w:p>
+        </w:tc>
+        <w:tc>
+          <w:tcPr>
+            <w:tcW w:type="dxa" w:w="2088"/>
+            <w:vAlign w:val="top"/>
+          </w:tcPr>
+          <w:p>
+            <w:pPr>
+              <w:jc w:val="left"/>
+            </w:pPr>
+            <w:r>
+              <w:rPr>
+                <w:rFonts w:ascii="Aptos" w:hAnsi="Aptos" w:eastAsia="PingFang SC"/>
+                <w:b w:val="0"/>
+                <w:sz w:val="16"/>
+              </w:rPr>
+              <w:t>Greed remained, but extreme greed cooled; equity funds saw outflows while technology and money-market funds saw inflows.</w:t>
+            </w:r>
+          </w:p>
+        </w:tc>
+        <w:tc>
+          <w:tcPr>
+            <w:tcW w:type="dxa" w:w="3528"/>
+            <w:vAlign w:val="top"/>
+          </w:tcPr>
+          <w:p>
+            <w:pPr>
+              <w:jc w:val="left"/>
+            </w:pPr>
+            <w:r>
+              <w:rPr>
+                <w:rFonts w:ascii="Aptos" w:hAnsi="Aptos" w:eastAsia="PingFang SC"/>
+                <w:b w:val="0"/>
+                <w:sz w:val="16"/>
+              </w:rPr>
+              <w:t>The market is not in a clean risk-on phase. It is a selective AI crowding phase.</w:t>
+            </w:r>
+          </w:p>
+        </w:tc>
+        <w:tc>
+          <w:tcPr>
+            <w:tcW w:type="dxa" w:w="2448"/>
+            <w:vAlign w:val="top"/>
+          </w:tcPr>
+          <w:p>
+            <w:pPr>
+              <w:jc w:val="center"/>
+            </w:pPr>
+            <w:r>
+              <w:rPr>
+                <w:rFonts w:ascii="Aptos" w:hAnsi="Aptos" w:eastAsia="PingFang SC"/>
+                <w:b w:val="0"/>
+                <w:sz w:val="16"/>
+              </w:rPr>
+              <w:t>Do not upgrade every Mag7 duration story just because AI attention is high.</w:t>
+            </w:r>
+          </w:p>
+        </w:tc>
+      </w:tr>
+      <w:tr>
+        <w:tc>
+          <w:tcPr>
+            <w:tcW w:type="dxa" w:w="1440"/>
+            <w:vAlign w:val="top"/>
+          </w:tcPr>
+          <w:p>
+            <w:pPr>
+              <w:jc w:val="center"/>
+            </w:pPr>
+            <w:r>
+              <w:rPr>
+                <w:rFonts w:ascii="Aptos" w:hAnsi="Aptos" w:eastAsia="PingFang SC"/>
+                <w:b w:val="0"/>
+                <w:sz w:val="16"/>
+              </w:rPr>
+              <w:t>NVDA post-earnings tape</w:t>
+            </w:r>
+          </w:p>
+        </w:tc>
+        <w:tc>
+          <w:tcPr>
+            <w:tcW w:type="dxa" w:w="2088"/>
+            <w:vAlign w:val="top"/>
+          </w:tcPr>
+          <w:p>
+            <w:pPr>
+              <w:jc w:val="left"/>
+            </w:pPr>
+            <w:r>
+              <w:rPr>
+                <w:rFonts w:ascii="Aptos" w:hAnsi="Aptos" w:eastAsia="PingFang SC"/>
+                <w:b w:val="0"/>
+                <w:sz w:val="16"/>
+              </w:rPr>
+              <w:t>Strong Q1 FY2027 figures coexisted with weekly share weakness.</w:t>
+            </w:r>
+          </w:p>
+        </w:tc>
+        <w:tc>
+          <w:tcPr>
+            <w:tcW w:type="dxa" w:w="3528"/>
+            <w:vAlign w:val="top"/>
+          </w:tcPr>
+          <w:p>
+            <w:pPr>
+              <w:jc w:val="left"/>
+            </w:pPr>
+            <w:r>
+              <w:rPr>
+                <w:rFonts w:ascii="Aptos" w:hAnsi="Aptos" w:eastAsia="PingFang SC"/>
+                <w:b w:val="0"/>
+                <w:sz w:val="16"/>
+              </w:rPr>
+              <w:t>Validates the distinction between fundamental winner and valuation/multiple loser.</w:t>
+            </w:r>
+          </w:p>
+        </w:tc>
+        <w:tc>
+          <w:tcPr>
+            <w:tcW w:type="dxa" w:w="2448"/>
+            <w:vAlign w:val="top"/>
+          </w:tcPr>
+          <w:p>
+            <w:pPr>
+              <w:jc w:val="center"/>
+            </w:pPr>
+            <w:r>
+              <w:rPr>
+                <w:rFonts w:ascii="Aptos" w:hAnsi="Aptos" w:eastAsia="PingFang SC"/>
+                <w:b w:val="0"/>
+                <w:sz w:val="16"/>
+              </w:rPr>
+              <w:t>Watch whether NVDA reclaims the 2026-05-20 close near 223.47 or stays closer to the 2026-05-22 close near 215.33.</w:t>
+            </w:r>
+          </w:p>
+        </w:tc>
+      </w:tr>
+      <w:tr>
+        <w:tc>
+          <w:tcPr>
+            <w:tcW w:type="dxa" w:w="1440"/>
+            <w:vAlign w:val="top"/>
+          </w:tcPr>
+          <w:p>
+            <w:pPr>
+              <w:jc w:val="center"/>
+            </w:pPr>
+            <w:r>
+              <w:rPr>
+                <w:rFonts w:ascii="Aptos" w:hAnsi="Aptos" w:eastAsia="PingFang SC"/>
+                <w:b w:val="0"/>
+                <w:sz w:val="16"/>
+              </w:rPr>
+              <w:t>MU/HBM strength</w:t>
+            </w:r>
+          </w:p>
+        </w:tc>
+        <w:tc>
+          <w:tcPr>
+            <w:tcW w:type="dxa" w:w="2088"/>
+            <w:vAlign w:val="top"/>
+          </w:tcPr>
+          <w:p>
+            <w:pPr>
+              <w:jc w:val="left"/>
+            </w:pPr>
+            <w:r>
+              <w:rPr>
+                <w:rFonts w:ascii="Aptos" w:hAnsi="Aptos" w:eastAsia="PingFang SC"/>
+                <w:b w:val="0"/>
+                <w:sz w:val="16"/>
+              </w:rPr>
+              <w:t>MU recovered from a sharp intraweek drawdown and still finished higher over the window.</w:t>
+            </w:r>
+          </w:p>
+        </w:tc>
+        <w:tc>
+          <w:tcPr>
+            <w:tcW w:type="dxa" w:w="3528"/>
+            <w:vAlign w:val="top"/>
+          </w:tcPr>
+          <w:p>
+            <w:pPr>
+              <w:jc w:val="left"/>
+            </w:pPr>
+            <w:r>
+              <w:rPr>
+                <w:rFonts w:ascii="Aptos" w:hAnsi="Aptos" w:eastAsia="PingFang SC"/>
+                <w:b w:val="0"/>
+                <w:sz w:val="16"/>
+              </w:rPr>
+              <w:t>AI infrastructure attention is moving into bottleneck suppliers.</w:t>
+            </w:r>
+          </w:p>
+        </w:tc>
+        <w:tc>
+          <w:tcPr>
+            <w:tcW w:type="dxa" w:w="2448"/>
+            <w:vAlign w:val="top"/>
+          </w:tcPr>
+          <w:p>
+            <w:pPr>
+              <w:jc w:val="center"/>
+            </w:pPr>
+            <w:r>
+              <w:rPr>
+                <w:rFonts w:ascii="Aptos" w:hAnsi="Aptos" w:eastAsia="PingFang SC"/>
+                <w:b w:val="0"/>
+                <w:sz w:val="16"/>
+              </w:rPr>
+              <w:t>NVDA is safer as earnings than as the only equity expression of AI capex.</w:t>
+            </w:r>
+          </w:p>
+        </w:tc>
+      </w:tr>
+      <w:tr>
+        <w:tc>
+          <w:tcPr>
+            <w:tcW w:type="dxa" w:w="1440"/>
+            <w:vAlign w:val="top"/>
+          </w:tcPr>
+          <w:p>
+            <w:pPr>
+              <w:jc w:val="center"/>
+            </w:pPr>
+            <w:r>
+              <w:rPr>
+                <w:rFonts w:ascii="Aptos" w:hAnsi="Aptos" w:eastAsia="PingFang SC"/>
+                <w:b w:val="0"/>
+                <w:sz w:val="16"/>
+              </w:rPr>
+              <w:t>ASTS liquidity event</w:t>
+            </w:r>
+          </w:p>
+        </w:tc>
+        <w:tc>
+          <w:tcPr>
+            <w:tcW w:type="dxa" w:w="2088"/>
+            <w:vAlign w:val="top"/>
+          </w:tcPr>
+          <w:p>
+            <w:pPr>
+              <w:jc w:val="left"/>
+            </w:pPr>
+            <w:r>
+              <w:rPr>
+                <w:rFonts w:ascii="Aptos" w:hAnsi="Aptos" w:eastAsia="PingFang SC"/>
+                <w:b w:val="0"/>
+                <w:sz w:val="16"/>
+              </w:rPr>
+              <w:t>ASTS gained sharply and became a weekend propagation candidate.</w:t>
+            </w:r>
+          </w:p>
+        </w:tc>
+        <w:tc>
+          <w:tcPr>
+            <w:tcW w:type="dxa" w:w="3528"/>
+            <w:vAlign w:val="top"/>
+          </w:tcPr>
+          <w:p>
+            <w:pPr>
+              <w:jc w:val="left"/>
+            </w:pPr>
+            <w:r>
+              <w:rPr>
+                <w:rFonts w:ascii="Aptos" w:hAnsi="Aptos" w:eastAsia="PingFang SC"/>
+                <w:b w:val="0"/>
+                <w:sz w:val="16"/>
+              </w:rPr>
+              <w:t>Retail attention is willing to buy infrastructure optionality outside Mag7.</w:t>
+            </w:r>
+          </w:p>
+        </w:tc>
+        <w:tc>
+          <w:tcPr>
+            <w:tcW w:type="dxa" w:w="2448"/>
+            <w:vAlign w:val="top"/>
+          </w:tcPr>
+          <w:p>
+            <w:pPr>
+              <w:jc w:val="center"/>
+            </w:pPr>
+            <w:r>
+              <w:rPr>
+                <w:rFonts w:ascii="Aptos" w:hAnsi="Aptos" w:eastAsia="PingFang SC"/>
+                <w:b w:val="0"/>
+                <w:sz w:val="16"/>
+              </w:rPr>
+              <w:t>Treat ASTS as a volatility signal, not as proof that Mag7 leadership is safe.</w:t>
+            </w:r>
+          </w:p>
+        </w:tc>
+      </w:tr>
+      <w:tr>
+        <w:tc>
+          <w:tcPr>
+            <w:tcW w:type="dxa" w:w="1440"/>
+            <w:vAlign w:val="top"/>
+          </w:tcPr>
+          <w:p>
+            <w:pPr>
+              <w:jc w:val="center"/>
+            </w:pPr>
+            <w:r>
+              <w:rPr>
+                <w:rFonts w:ascii="Aptos" w:hAnsi="Aptos" w:eastAsia="PingFang SC"/>
+                <w:b w:val="0"/>
+                <w:sz w:val="16"/>
+              </w:rPr>
+              <w:t>RDDT negative example</w:t>
+            </w:r>
+          </w:p>
+        </w:tc>
+        <w:tc>
+          <w:tcPr>
+            <w:tcW w:type="dxa" w:w="2088"/>
+            <w:vAlign w:val="top"/>
+          </w:tcPr>
+          <w:p>
+            <w:pPr>
+              <w:jc w:val="left"/>
+            </w:pPr>
+            <w:r>
+              <w:rPr>
+                <w:rFonts w:ascii="Aptos" w:hAnsi="Aptos" w:eastAsia="PingFang SC"/>
+                <w:b w:val="0"/>
+                <w:sz w:val="16"/>
+              </w:rPr>
+              <w:t>RDDT fell despite attention.</w:t>
+            </w:r>
+          </w:p>
+        </w:tc>
+        <w:tc>
+          <w:tcPr>
+            <w:tcW w:type="dxa" w:w="3528"/>
+            <w:vAlign w:val="top"/>
+          </w:tcPr>
+          <w:p>
+            <w:pPr>
+              <w:jc w:val="left"/>
+            </w:pPr>
+            <w:r>
+              <w:rPr>
+                <w:rFonts w:ascii="Aptos" w:hAnsi="Aptos" w:eastAsia="PingFang SC"/>
+                <w:b w:val="0"/>
+                <w:sz w:val="16"/>
+              </w:rPr>
+              <w:t>Mentions are not buy pressure.</w:t>
+            </w:r>
+          </w:p>
+        </w:tc>
+        <w:tc>
+          <w:tcPr>
+            <w:tcW w:type="dxa" w:w="2448"/>
+            <w:vAlign w:val="top"/>
+          </w:tcPr>
+          <w:p>
+            <w:pPr>
+              <w:jc w:val="center"/>
+            </w:pPr>
+            <w:r>
+              <w:rPr>
+                <w:rFonts w:ascii="Aptos" w:hAnsi="Aptos" w:eastAsia="PingFang SC"/>
+                <w:b w:val="0"/>
+                <w:sz w:val="16"/>
+              </w:rPr>
+              <w:t>Social screens should be used as crowding and reversal-risk inputs.</w:t>
+            </w:r>
+          </w:p>
+        </w:tc>
+      </w:tr>
+      <w:tr>
+        <w:tc>
+          <w:tcPr>
+            <w:tcW w:type="dxa" w:w="1440"/>
+            <w:vAlign w:val="top"/>
+          </w:tcPr>
+          <w:p>
+            <w:pPr>
+              <w:jc w:val="center"/>
+            </w:pPr>
+            <w:r>
+              <w:rPr>
+                <w:rFonts w:ascii="Aptos" w:hAnsi="Aptos" w:eastAsia="PingFang SC"/>
+                <w:b w:val="0"/>
+                <w:sz w:val="16"/>
+              </w:rPr>
+              <w:t>2026-05-26 open</w:t>
+            </w:r>
+          </w:p>
+        </w:tc>
+        <w:tc>
+          <w:tcPr>
+            <w:tcW w:type="dxa" w:w="2088"/>
+            <w:vAlign w:val="top"/>
+          </w:tcPr>
+          <w:p>
+            <w:pPr>
+              <w:jc w:val="left"/>
+            </w:pPr>
+            <w:r>
+              <w:rPr>
+                <w:rFonts w:ascii="Aptos" w:hAnsi="Aptos" w:eastAsia="PingFang SC"/>
+                <w:b w:val="0"/>
+                <w:sz w:val="16"/>
+              </w:rPr>
+              <w:t>U.S. markets are closed on 2026-05-25 for Memorial Day.</w:t>
+            </w:r>
+          </w:p>
+        </w:tc>
+        <w:tc>
+          <w:tcPr>
+            <w:tcW w:type="dxa" w:w="3528"/>
+            <w:vAlign w:val="top"/>
+          </w:tcPr>
+          <w:p>
+            <w:pPr>
+              <w:jc w:val="left"/>
+            </w:pPr>
+            <w:r>
+              <w:rPr>
+                <w:rFonts w:ascii="Aptos" w:hAnsi="Aptos" w:eastAsia="PingFang SC"/>
+                <w:b w:val="0"/>
+                <w:sz w:val="16"/>
+              </w:rPr>
+              <w:t>The tactical reaction window is Tuesday's U.S. cash open.</w:t>
+            </w:r>
+          </w:p>
+        </w:tc>
+        <w:tc>
+          <w:tcPr>
+            <w:tcW w:type="dxa" w:w="2448"/>
+            <w:vAlign w:val="top"/>
+          </w:tcPr>
+          <w:p>
+            <w:pPr>
+              <w:jc w:val="center"/>
+            </w:pPr>
+            <w:r>
+              <w:rPr>
+                <w:rFonts w:ascii="Aptos" w:hAnsi="Aptos" w:eastAsia="PingFang SC"/>
+                <w:b w:val="0"/>
+                <w:sz w:val="16"/>
+              </w:rPr>
+              <w:t>Compare NVDA, MU, AMD, DELL, ASTS, TSLA, and QQQ breadth in the first 90 minutes.</w:t>
+            </w:r>
+          </w:p>
+        </w:tc>
+      </w:tr>
+    </w:tbl>
+    <w:p/>
+    <w:p>
+      <w:r>
+        <w:t>External source links used in this overlay: Nasdaq holiday calendar, Amsflow U.S. Fear &amp; Greed, Reuters/LSEG fund-flow report via Investing.com, StockAnalysis price histories for NVDA, MU, ASTS, RDDT, TSLA, SPY and QQQ, NVIDIA Q1 FY2027 release, Micron investor materials, ASTS FCC/deployment report, AltIndex WSB tracker, and FearGreedMeter meme-stock tracker.</w:t>
+      </w:r>
+    </w:p>
+    <w:p>
+      <w:pPr>
+        <w:pStyle w:val="Heading2"/>
+      </w:pPr>
+      <w:r>
+        <w:t>6. Name-by-Name Assessment</w:t>
       </w:r>
     </w:p>
     <w:p>
@@ -2209,6 +3505,11 @@
     <w:p>
       <w:r>
         <w:t>Tesla is similar to Apple in one respect: the Institute corpus does not directly validate it as a winner in the AI capex-to-FCF chain. Its AI narrative is closer to autonomy, robotics, and option value, while the corpus is focused on infrastructure, cloud monetization, energy, custom silicon, and utilization.</w:t>
+      </w:r>
+    </w:p>
+    <w:p>
+      <w:r>
+        <w:t>The weekend tape strengthens this interpretation. TSLA was visible in social screens and price action was not weak, but it was not the clearest viral market object. MU converted the "AI needs memory" slogan into a tradable bottleneck story, ASTS converted regulatory authorization into a liquidity event, and NVDA remained the reference point for the entire AI infrastructure basket. Tesla's issue is therefore not lack of attention; it is that attention has not yet become a measurable AI-infrastructure cash-flow bridge.</w:t>
       </w:r>
     </w:p>
     <w:p>
@@ -2250,6 +3551,11 @@
     <w:p>
       <w:r>
         <w:t>The corpus confirms NVIDIA's fundamentals. The NVDA Q1 FY27 report treats data-center revenue as a capex output signal, with data center at 75.2 billion dollars and roughly 92% of total revenue. That is not weak demand.</w:t>
+      </w:r>
+    </w:p>
+    <w:p>
+      <w:r>
+        <w:t>The expanded source set makes the conclusion more disciplined. NVIDIA's Q1 FY2027 release showed record revenue of about 81.6 billion dollars, data-center revenue of 75.2 billion dollars, a 91.0 billion dollar Q2 revenue guide, an additional 80.0 billion dollar buyback authorization, and a dividend increase. Those figures argue against a fundamental loser label. The weakness is that the stock fell over the 2026-05-16 to 2026-05-22 observation window and the guide excluded China data-center compute revenue. The market is not denying AI demand; it is repricing concentration, geopolitics, supply-chain allocation, and whether the next dollar of AI infrastructure beta belongs to NVDA or to memory, networking, ODM, power, or ASIC exposure.</w:t>
       </w:r>
     </w:p>
     <w:p>
@@ -2321,7 +3627,7 @@
         <w:pStyle w:val="Heading2"/>
       </w:pPr>
       <w:r>
-        <w:t>6. Transmission Framework</w:t>
+        <w:t>7. Transmission Framework</w:t>
       </w:r>
     </w:p>
     <w:tbl>
@@ -2895,7 +4201,7 @@
         <w:pStyle w:val="Heading2"/>
       </w:pPr>
       <w:r>
-        <w:t>7. Scenario Analysis</w:t>
+        <w:t>8. Scenario Analysis</w:t>
       </w:r>
     </w:p>
     <w:tbl>
@@ -3244,6 +4550,84 @@
                 <w:b w:val="0"/>
                 <w:sz w:val="16"/>
               </w:rPr>
+              <w:t>Viral Attention Rotation Case</w:t>
+            </w:r>
+          </w:p>
+        </w:tc>
+        <w:tc>
+          <w:tcPr>
+            <w:tcW w:type="dxa" w:w="2088"/>
+            <w:vAlign w:val="top"/>
+          </w:tcPr>
+          <w:p>
+            <w:pPr>
+              <w:jc w:val="left"/>
+            </w:pPr>
+            <w:r>
+              <w:rPr>
+                <w:rFonts w:ascii="Aptos" w:hAnsi="Aptos" w:eastAsia="PingFang SC"/>
+                <w:b w:val="0"/>
+                <w:sz w:val="16"/>
+              </w:rPr>
+              <w:t>NVDA stays below the post-earnings close while MU/AMD/DELL/ASTS outperform; social screens remain concentrated in AI infrastructure alternatives</w:t>
+            </w:r>
+          </w:p>
+        </w:tc>
+        <w:tc>
+          <w:tcPr>
+            <w:tcW w:type="dxa" w:w="3528"/>
+            <w:vAlign w:val="top"/>
+          </w:tcPr>
+          <w:p>
+            <w:pPr>
+              <w:jc w:val="left"/>
+            </w:pPr>
+            <w:r>
+              <w:rPr>
+                <w:rFonts w:ascii="Aptos" w:hAnsi="Aptos" w:eastAsia="PingFang SC"/>
+                <w:b w:val="0"/>
+                <w:sz w:val="16"/>
+              </w:rPr>
+              <w:t>AI beta migrates from Mag7 leadership into bottleneck suppliers and option-like infrastructure names</w:t>
+            </w:r>
+          </w:p>
+        </w:tc>
+        <w:tc>
+          <w:tcPr>
+            <w:tcW w:type="dxa" w:w="2448"/>
+            <w:vAlign w:val="top"/>
+          </w:tcPr>
+          <w:p>
+            <w:pPr>
+              <w:jc w:val="center"/>
+            </w:pPr>
+            <w:r>
+              <w:rPr>
+                <w:rFonts w:ascii="Aptos" w:hAnsi="Aptos" w:eastAsia="PingFang SC"/>
+                <w:b w:val="0"/>
+                <w:sz w:val="16"/>
+              </w:rPr>
+              <w:t>Keep NVIDIA as a fundamentals winner but avoid treating it as the only AI-capex expression</w:t>
+            </w:r>
+          </w:p>
+        </w:tc>
+      </w:tr>
+      <w:tr>
+        <w:tc>
+          <w:tcPr>
+            <w:tcW w:type="dxa" w:w="1440"/>
+            <w:vAlign w:val="top"/>
+          </w:tcPr>
+          <w:p>
+            <w:pPr>
+              <w:jc w:val="center"/>
+            </w:pPr>
+            <w:r>
+              <w:rPr>
+                <w:rFonts w:ascii="Aptos" w:hAnsi="Aptos" w:eastAsia="PingFang SC"/>
+                <w:b w:val="0"/>
+                <w:sz w:val="16"/>
+              </w:rPr>
               <w:t>Efficiency Breakthrough Case</w:t>
             </w:r>
           </w:p>
@@ -3391,7 +4775,7 @@
         <w:pStyle w:val="Heading2"/>
       </w:pPr>
       <w:r>
-        <w:t>8. Portfolio Implications</w:t>
+        <w:t>9. Portfolio Implications</w:t>
       </w:r>
     </w:p>
     <w:tbl>
@@ -3700,7 +5084,7 @@
                 <w:b w:val="0"/>
                 <w:sz w:val="16"/>
               </w:rPr>
-              <w:t>Strong fundamentals but vulnerable to custom silicon, hyperscaler bargaining, and broader hardware profit-pool rotation</w:t>
+              <w:t>Strong fundamentals but vulnerable to custom silicon, hyperscaler bargaining, broader hardware profit-pool rotation, and post-earnings tape failing to confirm the earnings beat</w:t>
             </w:r>
           </w:p>
         </w:tc>
@@ -3719,7 +5103,7 @@
                 <w:b w:val="0"/>
                 <w:sz w:val="16"/>
               </w:rPr>
-              <w:t>Gross margin, cloud capex guidance, ASIC penetration, CoWoS/HBM/networking allocation</w:t>
+              <w:t>Gross margin, cloud capex guidance, ASIC penetration, CoWoS/HBM/networking allocation, relative strength versus MU/AMD/DELL/ASTS</w:t>
             </w:r>
           </w:p>
         </w:tc>
@@ -3809,7 +5193,7 @@
         <w:pStyle w:val="Heading2"/>
       </w:pPr>
       <w:r>
-        <w:t>9. Monitoring Dashboard</w:t>
+        <w:t>10. Monitoring Dashboard</w:t>
       </w:r>
     </w:p>
     <w:tbl>
@@ -4454,6 +5838,162 @@
           </w:p>
         </w:tc>
       </w:tr>
+      <w:tr>
+        <w:tc>
+          <w:tcPr>
+            <w:tcW w:type="dxa" w:w="1440"/>
+            <w:vAlign w:val="top"/>
+          </w:tcPr>
+          <w:p>
+            <w:pPr>
+              <w:jc w:val="center"/>
+            </w:pPr>
+            <w:r>
+              <w:rPr>
+                <w:rFonts w:ascii="Aptos" w:hAnsi="Aptos" w:eastAsia="PingFang SC"/>
+                <w:b w:val="0"/>
+                <w:sz w:val="16"/>
+              </w:rPr>
+              <w:t>Tactical Tape</w:t>
+            </w:r>
+          </w:p>
+        </w:tc>
+        <w:tc>
+          <w:tcPr>
+            <w:tcW w:type="dxa" w:w="2088"/>
+            <w:vAlign w:val="top"/>
+          </w:tcPr>
+          <w:p>
+            <w:pPr>
+              <w:jc w:val="left"/>
+            </w:pPr>
+            <w:r>
+              <w:rPr>
+                <w:rFonts w:ascii="Aptos" w:hAnsi="Aptos" w:eastAsia="PingFang SC"/>
+                <w:b w:val="0"/>
+                <w:sz w:val="16"/>
+              </w:rPr>
+              <w:t>NVDA versus MU/AMD/DELL/ASTS in the first 90 minutes of the 2026-05-26 cash session</w:t>
+            </w:r>
+          </w:p>
+        </w:tc>
+        <w:tc>
+          <w:tcPr>
+            <w:tcW w:type="dxa" w:w="3528"/>
+            <w:vAlign w:val="top"/>
+          </w:tcPr>
+          <w:p>
+            <w:pPr>
+              <w:jc w:val="left"/>
+            </w:pPr>
+            <w:r>
+              <w:rPr>
+                <w:rFonts w:ascii="Aptos" w:hAnsi="Aptos" w:eastAsia="PingFang SC"/>
+                <w:b w:val="0"/>
+                <w:sz w:val="16"/>
+              </w:rPr>
+              <w:t>Confirms whether post-weekend money returns to NVDA or rotates to alternative AI infrastructure beta</w:t>
+            </w:r>
+          </w:p>
+        </w:tc>
+        <w:tc>
+          <w:tcPr>
+            <w:tcW w:type="dxa" w:w="2448"/>
+            <w:vAlign w:val="top"/>
+          </w:tcPr>
+          <w:p>
+            <w:pPr>
+              <w:jc w:val="center"/>
+            </w:pPr>
+            <w:r>
+              <w:rPr>
+                <w:rFonts w:ascii="Aptos" w:hAnsi="Aptos" w:eastAsia="PingFang SC"/>
+                <w:b w:val="0"/>
+                <w:sz w:val="16"/>
+              </w:rPr>
+              <w:t>Evidence 15, 18, 20, 21, 23</w:t>
+            </w:r>
+          </w:p>
+        </w:tc>
+      </w:tr>
+      <w:tr>
+        <w:tc>
+          <w:tcPr>
+            <w:tcW w:type="dxa" w:w="1440"/>
+            <w:vAlign w:val="top"/>
+          </w:tcPr>
+          <w:p>
+            <w:pPr>
+              <w:jc w:val="center"/>
+            </w:pPr>
+            <w:r>
+              <w:rPr>
+                <w:rFonts w:ascii="Aptos" w:hAnsi="Aptos" w:eastAsia="PingFang SC"/>
+                <w:b w:val="0"/>
+                <w:sz w:val="16"/>
+              </w:rPr>
+              <w:t>Social Attention Quality</w:t>
+            </w:r>
+          </w:p>
+        </w:tc>
+        <w:tc>
+          <w:tcPr>
+            <w:tcW w:type="dxa" w:w="2088"/>
+            <w:vAlign w:val="top"/>
+          </w:tcPr>
+          <w:p>
+            <w:pPr>
+              <w:jc w:val="left"/>
+            </w:pPr>
+            <w:r>
+              <w:rPr>
+                <w:rFonts w:ascii="Aptos" w:hAnsi="Aptos" w:eastAsia="PingFang SC"/>
+                <w:b w:val="0"/>
+                <w:sz w:val="16"/>
+              </w:rPr>
+              <w:t>RDDT-style mention/price divergence and TSLA attention without leadership</w:t>
+            </w:r>
+          </w:p>
+        </w:tc>
+        <w:tc>
+          <w:tcPr>
+            <w:tcW w:type="dxa" w:w="3528"/>
+            <w:vAlign w:val="top"/>
+          </w:tcPr>
+          <w:p>
+            <w:pPr>
+              <w:jc w:val="left"/>
+            </w:pPr>
+            <w:r>
+              <w:rPr>
+                <w:rFonts w:ascii="Aptos" w:hAnsi="Aptos" w:eastAsia="PingFang SC"/>
+                <w:b w:val="0"/>
+                <w:sz w:val="16"/>
+              </w:rPr>
+              <w:t>Separates true incremental buying from noisy social discussion</w:t>
+            </w:r>
+          </w:p>
+        </w:tc>
+        <w:tc>
+          <w:tcPr>
+            <w:tcW w:type="dxa" w:w="2448"/>
+            <w:vAlign w:val="top"/>
+          </w:tcPr>
+          <w:p>
+            <w:pPr>
+              <w:jc w:val="center"/>
+            </w:pPr>
+            <w:r>
+              <w:rPr>
+                <w:rFonts w:ascii="Aptos" w:hAnsi="Aptos" w:eastAsia="PingFang SC"/>
+                <w:b w:val="0"/>
+                <w:sz w:val="16"/>
+              </w:rPr>
+              <w:t>Evidence 22, 23</w:t>
+            </w:r>
+          </w:p>
+        </w:tc>
+      </w:tr>
     </w:tbl>
     <w:p/>
     <w:p>
@@ -4461,7 +6001,7 @@
         <w:pStyle w:val="Heading2"/>
       </w:pPr>
       <w:r>
-        <w:t>10. Verdict</w:t>
+        <w:t>11. Verdict</w:t>
       </w:r>
     </w:p>
     <w:p>
@@ -4481,12 +6021,12 @@
     </w:p>
     <w:p>
       <w:r>
-        <w:t>3. **Valuation loser candidate: NVIDIA.** NVIDIA is still a fundamental AI winner, but the corpus warns that scarcity multiple can compress as the profit pool broadens to ASICs, networking, HBM, CoWoS, ODMs, power equipment, and efficiency.</w:t>
+        <w:t>3. **Valuation loser candidate: NVIDIA.** NVIDIA is still a fundamental AI winner, and the expanded source set reinforces that point. The risk is more precise: scarcity multiple can compress as the profit pool broadens to ASICs, networking, HBM, CoWoS, ODMs, power equipment, efficiency, and retail attention migrates to alternative AI-infrastructure beta after strong earnings.</w:t>
       </w:r>
     </w:p>
     <w:p>
       <w:r>
-        <w:t>Microsoft and Alphabet are the best defended. Amazon sits in the middle. Tesla is a narrative-duration risk unless autonomy or robotics turns into measurable recurring cash flow. The next era will not simply reward "AI exposure"; it will reward **proved conversion of AI capex into high-density revenue, lower unit cost, and free cash flow**.</w:t>
+        <w:t>Microsoft and Alphabet are the best defended. Amazon sits in the middle. Tesla is a narrative-duration risk unless autonomy or robotics turns into measurable recurring cash flow. The weekend viral-market evidence adds a timing layer: the 2026-05-26 U.S. cash open should show whether money returns to NVDA or keeps rotating into MU/AMD/DELL/ASTS-style alternatives. The next era will not simply reward "AI exposure"; it will reward **proved conversion of AI capex into high-density revenue, lower unit cost, and free cash flow**.</w:t>
       </w:r>
     </w:p>
     <w:sectPr>

</xml_diff>